<commit_message>
Update presentation materials for "Khai thác các mẫu hiếm" with revised slides, speaker notes, and new PPTX versions; enhance content clarity and accuracy.
</commit_message>
<xml_diff>
--- a/bao_cao_rare_pattern_mining.docx
+++ b/bao_cao_rare_pattern_mining.docx
@@ -34,32 +34,6 @@
         <w:t xml:space="preserve">Tháng 6 năm 2026</w:t>
       </w:r>
     </w:p>
-    <w:sdt>
-      <w:sdtPr>
-        <w:docPartObj>
-          <w:docPartGallery w:val="Table of Contents"/>
-          <w:docPartUnique/>
-        </w:docPartObj>
-      </w:sdtPr>
-      <w:sdtContent>
-        <w:p>
-          <w:pPr>
-            <w:pStyle w:val="TOCHeading"/>
-          </w:pPr>
-          <w:r>
-            <w:t xml:space="preserve">Table of Contents</w:t>
-          </w:r>
-        </w:p>
-        <w:p>
-          <w:r>
-            <w:fldChar w:fldCharType="begin" w:dirty="true"/>
-            <w:instrText xml:space="preserve">TOC \o "1-2" \h \z \u</w:instrText>
-            <w:fldChar w:fldCharType="separate"/>
-            <w:fldChar w:fldCharType="end"/>
-          </w:r>
-        </w:p>
-      </w:sdtContent>
-    </w:sdt>
     <w:bookmarkStart w:id="9" w:name="tóm-tắt"/>
     <w:p>
       <w:pPr>
@@ -116,13 +90,13 @@
         <w:t xml:space="preserve"> </w:t>
       </w:r>
       <w:r>
-        <w:t xml:space="preserve">chiếu với từng con số trong bài giảng — đạt 100%, đồng thời phát hiện một thiếu sót</w:t>
-      </w:r>
-      <w:r>
-        <w:t xml:space="preserve"> </w:t>
-      </w:r>
-      <w:r>
-        <w:t xml:space="preserve">nhỏ trong danh sách kết quả FIM của slide. Thực nghiệm trên bộ dữ liệu UCI Mushroom</w:t>
+        <w:t xml:space="preserve">chiếu với kết quả tính tay trên ví dụ minh họa — đạt 100%. Thực nghiệm trên bộ dữ</w:t>
+      </w:r>
+      <w:r>
+        <w:t xml:space="preserve"> </w:t>
+      </w:r>
+      <w:r>
+        <w:t xml:space="preserve">liệu UCI Mushroom</w:t>
       </w:r>
       <w:r>
         <w:t xml:space="preserve"> </w:t>
@@ -1491,7 +1465,7 @@
           <w:b/>
           <w:bCs/>
         </w:rPr>
-        <w:t xml:space="preserve">Ví dụ chạy xuyên suốt.</w:t>
+        <w:t xml:space="preserve">Ví dụ.</w:t>
       </w:r>
       <w:r>
         <w:t xml:space="preserve"> </w:t>
@@ -10097,13 +10071,13 @@
       </w:r>
     </w:p>
     <w:bookmarkEnd w:id="30"/>
-    <w:bookmarkStart w:id="31" w:name="kiểm-chứng-đúng-đắn-trên-ví-dụ-bài-giảng"/>
+    <w:bookmarkStart w:id="31" w:name="kiểm-chứng-đúng-đắn-trên-ví-dụ-minh-họa"/>
     <w:p>
       <w:pPr>
         <w:pStyle w:val="Heading2"/>
       </w:pPr>
       <w:r>
-        <w:t xml:space="preserve">4.2. Kiểm chứng đúng đắn trên ví dụ bài giảng</w:t>
+        <w:t xml:space="preserve">4.2. Kiểm chứng đúng đắn trên ví dụ minh họa</w:t>
       </w:r>
     </w:p>
     <w:p>
@@ -10172,7 +10146,7 @@
         <w:t xml:space="preserve"> </w:t>
       </w:r>
       <w:r>
-        <w:t xml:space="preserve">in trong bài giảng: 19 câu lệnh assert phủ FIM, AprioriRare, AprioriInverse,</w:t>
+        <w:t xml:space="preserve">kỳ vọng đã tính tay trên ví dụ minh họa (bảng 2.1): 19 câu lệnh assert phủ FIM, AprioriRare, AprioriInverse,</w:t>
       </w:r>
       <w:r>
         <w:t xml:space="preserve"> </w:t>
@@ -10516,168 +10490,12 @@
         </w:numPr>
       </w:pPr>
       <w:r>
-        <w:t xml:space="preserve">bond, all-confidence: khớp toàn bộ giá trị trong bài giảng, kể cả Tính chất 1 (khớp)</w:t>
+        <w:t xml:space="preserve">bond, all-confidence: khớp toàn bộ giá trị kỳ vọng, kể cả Tính chất 1 (khớp)</w:t>
       </w:r>
     </w:p>
     <w:p>
       <w:pPr>
         <w:pStyle w:val="FirstParagraph"/>
-      </w:pPr>
-      <w:r>
-        <w:t xml:space="preserve">Quá trình kiểm chứng phát hiện một</w:t>
-      </w:r>
-      <w:r>
-        <w:t xml:space="preserve"> </w:t>
-      </w:r>
-      <w:r>
-        <w:rPr>
-          <w:b/>
-          <w:bCs/>
-        </w:rPr>
-        <w:t xml:space="preserve">thiếu sót nhỏ trong slide bài giảng</w:t>
-      </w:r>
-      <w:r>
-        <w:t xml:space="preserve">: danh sách</w:t>
-      </w:r>
-      <w:r>
-        <w:t xml:space="preserve"> </w:t>
-      </w:r>
-      <w:r>
-        <w:t xml:space="preserve">chữ ở trang</w:t>
-      </w:r>
-      <w:r>
-        <w:t xml:space="preserve"> </w:t>
-      </w:r>
-      <w:r>
-        <w:t xml:space="preserve">“Example”</w:t>
-      </w:r>
-      <w:r>
-        <w:t xml:space="preserve"> </w:t>
-      </w:r>
-      <w:r>
-        <w:t xml:space="preserve">(FIM,</w:t>
-      </w:r>
-      <w:r>
-        <w:t xml:space="preserve"> </w:t>
-      </w:r>
-      <m:oMath>
-        <m:r>
-          <m:t>m</m:t>
-        </m:r>
-        <m:r>
-          <m:t>i</m:t>
-        </m:r>
-        <m:r>
-          <m:t>n</m:t>
-        </m:r>
-        <m:r>
-          <m:t>s</m:t>
-        </m:r>
-        <m:r>
-          <m:t>u</m:t>
-        </m:r>
-        <m:r>
-          <m:t>p</m:t>
-        </m:r>
-        <m:r>
-          <m:rPr>
-            <m:sty m:val="p"/>
-          </m:rPr>
-          <m:t>=</m:t>
-        </m:r>
-        <m:r>
-          <m:t>2</m:t>
-        </m:r>
-      </m:oMath>
-      <w:r>
-        <w:t xml:space="preserve">) liệt kê 10 itemset phổ biến, bỏ sót</w:t>
-      </w:r>
-      <w:r>
-        <w:t xml:space="preserve"> </w:t>
-      </w:r>
-      <w:r>
-        <w:rPr>
-          <w:b/>
-          <w:bCs/>
-        </w:rPr>
-        <w:t xml:space="preserve">{pasta, orange, cake}</w:t>
-      </w:r>
-      <w:r>
-        <w:t xml:space="preserve"> </w:t>
-      </w:r>
-      <w:r>
-        <w:t xml:space="preserve">(</w:t>
-      </w:r>
-      <m:oMath>
-        <m:r>
-          <m:t>s</m:t>
-        </m:r>
-        <m:r>
-          <m:t>u</m:t>
-        </m:r>
-        <m:r>
-          <m:t>p</m:t>
-        </m:r>
-        <m:r>
-          <m:rPr>
-            <m:sty m:val="p"/>
-          </m:rPr>
-          <m:t>=</m:t>
-        </m:r>
-        <m:r>
-          <m:t>2</m:t>
-        </m:r>
-      </m:oMath>
-      <w:r>
-        <w:t xml:space="preserve">, xuất hiện trong T3 và T4). Hình lattice ở đầu</w:t>
-      </w:r>
-      <w:r>
-        <w:t xml:space="preserve"> </w:t>
-      </w:r>
-      <w:r>
-        <w:t xml:space="preserve">slide lại vẽ đúng node</w:t>
-      </w:r>
-      <w:r>
-        <w:t xml:space="preserve"> </w:t>
-      </w:r>
-      <w:r>
-        <w:rPr>
-          <w:rStyle w:val="VerbatimChar"/>
-        </w:rPr>
-        <w:t xml:space="preserve">poc</w:t>
-      </w:r>
-      <w:r>
-        <w:t xml:space="preserve"> </w:t>
-      </w:r>
-      <w:r>
-        <w:t xml:space="preserve">thuộc vùng phổ biến — tức kết quả đúng là</w:t>
-      </w:r>
-      <w:r>
-        <w:t xml:space="preserve"> </w:t>
-      </w:r>
-      <w:r>
-        <w:rPr>
-          <w:b/>
-          <w:bCs/>
-        </w:rPr>
-        <w:t xml:space="preserve">11</w:t>
-      </w:r>
-      <w:r>
-        <w:t xml:space="preserve"> </w:t>
-      </w:r>
-      <w:r>
-        <w:t xml:space="preserve">itemset.</w:t>
-      </w:r>
-      <w:r>
-        <w:t xml:space="preserve"> </w:t>
-      </w:r>
-      <w:r>
-        <w:t xml:space="preserve">Việc đối chiếu tự động giúp phát hiện loại sai lệch này một cách hệ thống.</w:t>
-      </w:r>
-    </w:p>
-    <w:p>
-      <w:pPr>
-        <w:pStyle w:val="BodyText"/>
       </w:pPr>
       <w:r>
         <w:t xml:space="preserve">Bảng độ đo cặp cho {pasta, cake} minh họa trực quan vấn đề mẫu giả (mục 2.3):</w:t>
@@ -13274,13 +13092,7 @@
         <w:t xml:space="preserve"> </w:t>
       </w:r>
       <w:r>
-        <w:t xml:space="preserve">với mọi con số trong ví dụ bài giảng (quá trình này còn phát hiện một</w:t>
-      </w:r>
-      <w:r>
-        <w:t xml:space="preserve"> </w:t>
-      </w:r>
-      <w:r>
-        <w:t xml:space="preserve">thiếu sót nhỏ trong danh sách kết quả FIM của slide). Thực nghiệm trên UCI Mushroom</w:t>
+        <w:t xml:space="preserve">với mọi con số trong ví dụ minh họa. Thực nghiệm trên UCI Mushroom</w:t>
       </w:r>
       <w:r>
         <w:t xml:space="preserve"> </w:t>

</xml_diff>